<commit_message>
docs(sprint13): add PPT and update SRS/SAD for institutional API and wearables scope
Add a new project presentation deck and extend the SRS/SAD with RF-013/RF-014,
CU-015/CU-016 (SRS) and CU-006/CU-007 (SAD) so the institutional MINSA/DIRESA/
SINADEF API and the wearables clinical validation layer from Sprint 13 are
finally reflected in the formal requirements and architecture documentation.

Co-Authored-By: Claude Sonnet 5 <noreply@anthropic.com>
</commit_message>
<xml_diff>
--- a/Documentation/FD03-EPIS-Informe SRS de Proyecto.docx
+++ b/Documentation/FD03-EPIS-Informe SRS de Proyecto.docx
@@ -1322,6 +1322,68 @@
           </w:p>
         </w:tc>
       </w:tr>
+      <w:tr>
+        <w:tc>
+          <w:tcPr>
+            <w:tcW w:type="dxa" w:w="900"/>
+          </w:tcPr>
+          <w:p>
+            <w:r>
+              <w:t>3.0</w:t>
+            </w:r>
+          </w:p>
+        </w:tc>
+        <w:tc>
+          <w:tcPr>
+            <w:tcW w:type="dxa" w:w="1300"/>
+          </w:tcPr>
+          <w:p>
+            <w:r>
+              <w:t>CCL</w:t>
+            </w:r>
+          </w:p>
+        </w:tc>
+        <w:tc>
+          <w:tcPr>
+            <w:tcW w:type="dxa" w:w="1300"/>
+          </w:tcPr>
+          <w:p>
+            <w:r>
+              <w:t>AFR</w:t>
+            </w:r>
+          </w:p>
+        </w:tc>
+        <w:tc>
+          <w:tcPr>
+            <w:tcW w:type="dxa" w:w="1300"/>
+          </w:tcPr>
+          <w:p>
+            <w:r>
+              <w:t>AFR</w:t>
+            </w:r>
+          </w:p>
+        </w:tc>
+        <w:tc>
+          <w:tcPr>
+            <w:tcW w:type="dxa" w:w="1500"/>
+          </w:tcPr>
+          <w:p>
+            <w:r>
+              <w:t>Septiembre 2026</w:t>
+            </w:r>
+          </w:p>
+        </w:tc>
+        <w:tc>
+          <w:tcPr>
+            <w:tcW w:type="dxa" w:w="3160"/>
+          </w:tcPr>
+          <w:p>
+            <w:r>
+              <w:t>Actualización: incorporación de RF-013 (interoperabilidad institucional MINSA/DIRESA/SINADEF) y RF-014 (wearables como capa de validación clínica) — extensión de alcance Sprint 13, con nuevos casos de uso CU-015 y CU-016.</w:t>
+            </w:r>
+          </w:p>
+        </w:tc>
+      </w:tr>
     </w:tbl>
     <w:p/>
     <w:p>
@@ -2830,6 +2892,34 @@
     </w:p>
     <w:p>
       <w:pPr>
+        <w:pStyle w:val="Prrafodelista"/>
+        <w:numPr>
+          <w:ilvl w:val="0"/>
+          <w:numId w:val="2"/>
+        </w:numPr>
+        <w:spacing w:after="40" w:line="264" w:lineRule="auto"/>
+        <w:jc w:val="both"/>
+      </w:pPr>
+      <w:r>
+        <w:t>API de interoperabilidad institucional para MINSA, DIRESA y SINADEF (autenticación por API Key, alcances y auditoría).</w:t>
+      </w:r>
+    </w:p>
+    <w:p>
+      <w:pPr>
+        <w:pStyle w:val="Prrafodelista"/>
+        <w:numPr>
+          <w:ilvl w:val="0"/>
+          <w:numId w:val="2"/>
+        </w:numPr>
+        <w:spacing w:after="40" w:line="264" w:lineRule="auto"/>
+        <w:jc w:val="both"/>
+      </w:pPr>
+      <w:r>
+        <w:t>Integración de wearables (BLE, Health Connect, HealthKit) como capa de validación clínica de las predicciones de la IA.</w:t>
+      </w:r>
+    </w:p>
+    <w:p>
+      <w:pPr>
         <w:spacing w:after="120" w:line="276" w:lineRule="auto"/>
         <w:jc w:val="both"/>
       </w:pPr>
@@ -5192,6 +5282,70 @@
           </w:p>
         </w:tc>
       </w:tr>
+      <w:tr>
+        <w:tc>
+          <w:tcPr>
+            <w:tcW w:type="dxa" w:w="1500"/>
+          </w:tcPr>
+          <w:p>
+            <w:r>
+              <w:t>RF-013</w:t>
+            </w:r>
+          </w:p>
+        </w:tc>
+        <w:tc>
+          <w:tcPr>
+            <w:tcW w:type="dxa" w:w="2600"/>
+          </w:tcPr>
+          <w:p>
+            <w:r>
+              <w:t>Interoperabilidad institucional (MINSA/DIRESA/SINADEF)</w:t>
+            </w:r>
+          </w:p>
+        </w:tc>
+        <w:tc>
+          <w:tcPr>
+            <w:tcW w:type="dxa" w:w="5250"/>
+          </w:tcPr>
+          <w:p>
+            <w:r>
+              <w:t>El sistema debe exponer una API institucional con autenticación por clave, permisos por alcance y limitación de solicitudes, para que MINSA, DIRESA y SINADEF puedan consultar datos epidemiológicos y de mortalidad respiratoria de forma auditada.</w:t>
+            </w:r>
+          </w:p>
+        </w:tc>
+      </w:tr>
+      <w:tr>
+        <w:tc>
+          <w:tcPr>
+            <w:tcW w:type="dxa" w:w="1500"/>
+          </w:tcPr>
+          <w:p>
+            <w:r>
+              <w:t>RF-014</w:t>
+            </w:r>
+          </w:p>
+        </w:tc>
+        <w:tc>
+          <w:tcPr>
+            <w:tcW w:type="dxa" w:w="2600"/>
+          </w:tcPr>
+          <w:p>
+            <w:r>
+              <w:t>Wearables como validación clínica</w:t>
+            </w:r>
+          </w:p>
+        </w:tc>
+        <w:tc>
+          <w:tcPr>
+            <w:tcW w:type="dxa" w:w="5250"/>
+          </w:tcPr>
+          <w:p>
+            <w:r>
+              <w:t>El sistema debe permitir el ingreso de signos vitales desde dispositivos wearables (frecuencia cardíaca, SpO2) y usarlos como una capa de validación clínica basada en reglas sobre las predicciones de la IA, con reversión automática si el dato no es confiable.</w:t>
+            </w:r>
+          </w:p>
+        </w:tc>
+      </w:tr>
     </w:tbl>
     <w:p>
       <w:pPr>
@@ -9029,6 +9183,150 @@
                 <w:szCs w:val="19"/>
               </w:rPr>
               <w:t>Baja</w:t>
+            </w:r>
+          </w:p>
+        </w:tc>
+      </w:tr>
+      <w:tr>
+        <w:tc>
+          <w:tcPr>
+            <w:tcW w:type="dxa" w:w="639"/>
+          </w:tcPr>
+          <w:p>
+            <w:r>
+              <w:t>RF-013</w:t>
+            </w:r>
+          </w:p>
+        </w:tc>
+        <w:tc>
+          <w:tcPr>
+            <w:tcW w:type="dxa" w:w="1367"/>
+          </w:tcPr>
+          <w:p>
+            <w:r>
+              <w:t>Interoperabilidad institucional (MINSA/DIRESA/SINADEF)</w:t>
+            </w:r>
+          </w:p>
+        </w:tc>
+        <w:tc>
+          <w:tcPr>
+            <w:tcW w:type="dxa" w:w="1655"/>
+          </w:tcPr>
+          <w:p>
+            <w:r>
+              <w:t>El sistema debe exponer una API institucional con autenticación por clave, permisos por alcance y limitación de solicitudes, para que MINSA, DIRESA y SINADEF puedan consultar datos epidemiológicos y de mortalidad respiratoria de forma auditada.</w:t>
+            </w:r>
+          </w:p>
+        </w:tc>
+        <w:tc>
+          <w:tcPr>
+            <w:tcW w:type="dxa" w:w="1237"/>
+          </w:tcPr>
+          <w:p>
+            <w:r>
+              <w:t>Solicitud HTTP autenticada con API Key institucional (MINSA/DIRESA/SINADEF) y parámetros de consulta epidemiológica.</w:t>
+            </w:r>
+          </w:p>
+        </w:tc>
+        <w:tc>
+          <w:tcPr>
+            <w:tcW w:type="dxa" w:w="2030"/>
+          </w:tcPr>
+          <w:p>
+            <w:r>
+              <w:t>El sistema valida la API Key, verifica el alcance (scope) autorizado, aplica límite de solicitudes (rate limiting) y registra la solicitud en la bitácora de auditoría.</w:t>
+            </w:r>
+          </w:p>
+        </w:tc>
+        <w:tc>
+          <w:tcPr>
+            <w:tcW w:type="dxa" w:w="1532"/>
+          </w:tcPr>
+          <w:p>
+            <w:r>
+              <w:t>Datos epidemiológicos o de mortalidad respiratoria en el formato definido por la especificación OpenAPI institucional.</w:t>
+            </w:r>
+          </w:p>
+        </w:tc>
+        <w:tc>
+          <w:tcPr>
+            <w:tcW w:type="dxa" w:w="890"/>
+          </w:tcPr>
+          <w:p>
+            <w:r>
+              <w:t>Alta</w:t>
+            </w:r>
+          </w:p>
+        </w:tc>
+      </w:tr>
+      <w:tr>
+        <w:tc>
+          <w:tcPr>
+            <w:tcW w:type="dxa" w:w="639"/>
+          </w:tcPr>
+          <w:p>
+            <w:r>
+              <w:t>RF-014</w:t>
+            </w:r>
+          </w:p>
+        </w:tc>
+        <w:tc>
+          <w:tcPr>
+            <w:tcW w:type="dxa" w:w="1367"/>
+          </w:tcPr>
+          <w:p>
+            <w:r>
+              <w:t>Wearables como validación clínica</w:t>
+            </w:r>
+          </w:p>
+        </w:tc>
+        <w:tc>
+          <w:tcPr>
+            <w:tcW w:type="dxa" w:w="1655"/>
+          </w:tcPr>
+          <w:p>
+            <w:r>
+              <w:t>El sistema debe permitir el ingreso de signos vitales desde dispositivos wearables (frecuencia cardíaca, SpO2) y usarlos como una capa de validación clínica basada en reglas sobre las predicciones de la IA, con reversión automática si el dato no es confiable.</w:t>
+            </w:r>
+          </w:p>
+        </w:tc>
+        <w:tc>
+          <w:tcPr>
+            <w:tcW w:type="dxa" w:w="1237"/>
+          </w:tcPr>
+          <w:p>
+            <w:r>
+              <w:t>Signos vitales del paciente capturados por wearable (frecuencia cardíaca, SpO2) mediante BLE, Health Connect o HealthKit.</w:t>
+            </w:r>
+          </w:p>
+        </w:tc>
+        <w:tc>
+          <w:tcPr>
+            <w:tcW w:type="dxa" w:w="2030"/>
+          </w:tcPr>
+          <w:p>
+            <w:r>
+              <w:t>El sistema aplica reglas clínicas de validación sobre la predicción de la IA usando los signos vitales; si el dato no es confiable, revierte automáticamente al resultado del modelo sin el signo vital.</w:t>
+            </w:r>
+          </w:p>
+        </w:tc>
+        <w:tc>
+          <w:tcPr>
+            <w:tcW w:type="dxa" w:w="1532"/>
+          </w:tcPr>
+          <w:p>
+            <w:r>
+              <w:t>Predicción validada (o no) con indicación de si fue ajustada por señales del wearable.</w:t>
+            </w:r>
+          </w:p>
+        </w:tc>
+        <w:tc>
+          <w:tcPr>
+            <w:tcW w:type="dxa" w:w="890"/>
+          </w:tcPr>
+          <w:p>
+            <w:r>
+              <w:t>Alta</w:t>
             </w:r>
           </w:p>
         </w:tc>
@@ -12876,6 +13174,70 @@
           </w:p>
         </w:tc>
       </w:tr>
+      <w:tr>
+        <w:tc>
+          <w:tcPr>
+            <w:tcW w:type="dxa" w:w="1000"/>
+          </w:tcPr>
+          <w:p>
+            <w:r>
+              <w:t>CU-015</w:t>
+            </w:r>
+          </w:p>
+        </w:tc>
+        <w:tc>
+          <w:tcPr>
+            <w:tcW w:type="dxa" w:w="4460"/>
+          </w:tcPr>
+          <w:p>
+            <w:r>
+              <w:t>Consultar datos epidemiológicos institucionales</w:t>
+            </w:r>
+          </w:p>
+        </w:tc>
+        <w:tc>
+          <w:tcPr>
+            <w:tcW w:type="dxa" w:w="2500"/>
+          </w:tcPr>
+          <w:p>
+            <w:r>
+              <w:t>Sistema institucional externo (MINSA/DIRESA/SINADEF)</w:t>
+            </w:r>
+          </w:p>
+        </w:tc>
+      </w:tr>
+      <w:tr>
+        <w:tc>
+          <w:tcPr>
+            <w:tcW w:type="dxa" w:w="1000"/>
+          </w:tcPr>
+          <w:p>
+            <w:r>
+              <w:t>CU-016</w:t>
+            </w:r>
+          </w:p>
+        </w:tc>
+        <w:tc>
+          <w:tcPr>
+            <w:tcW w:type="dxa" w:w="4460"/>
+          </w:tcPr>
+          <w:p>
+            <w:r>
+              <w:t>Validar predicción de IA con signos vitales del wearable</w:t>
+            </w:r>
+          </w:p>
+        </w:tc>
+        <w:tc>
+          <w:tcPr>
+            <w:tcW w:type="dxa" w:w="2500"/>
+          </w:tcPr>
+          <w:p>
+            <w:r>
+              <w:t>Paciente / Sistema de IA</w:t>
+            </w:r>
+          </w:p>
+        </w:tc>
+      </w:tr>
     </w:tbl>
     <w:p>
       <w:pPr>
@@ -16072,6 +16434,326 @@
       </w:pPr>
       <w:r>
         <w:t>2a. Ubicación no disponible: el sistema solicita al usuario ingresar su distrito manualmente.</w:t>
+      </w:r>
+    </w:p>
+    <w:p>
+      <w:pPr>
+        <w:pStyle w:val="Ttulo3"/>
+      </w:pPr>
+      <w:r>
+        <w:t>CU-015: Consultar datos epidemiológicos institucionales</w:t>
+      </w:r>
+    </w:p>
+    <w:p>
+      <w:pPr/>
+      <w:r>
+        <w:rPr>
+          <w:b/>
+        </w:rPr>
+        <w:t xml:space="preserve">Actores: </w:t>
+      </w:r>
+      <w:r>
+        <w:t>Sistema institucional externo (MINSA/DIRESA/SINADEF)</w:t>
+      </w:r>
+    </w:p>
+    <w:p>
+      <w:pPr/>
+      <w:r>
+        <w:rPr>
+          <w:b/>
+        </w:rPr>
+        <w:t xml:space="preserve">Precondiciones: </w:t>
+      </w:r>
+      <w:r>
+        <w:t>La institución cuenta con una API Key vigente y un alcance (scope) autorizado para el recurso solicitado.</w:t>
+      </w:r>
+    </w:p>
+    <w:p>
+      <w:pPr/>
+      <w:r>
+        <w:rPr>
+          <w:b/>
+        </w:rPr>
+        <w:t>Flujo principal:</w:t>
+      </w:r>
+    </w:p>
+    <w:p>
+      <w:pPr>
+        <w:pStyle w:val="Prrafodelista"/>
+        <w:numPr>
+          <w:ilvl w:val="0"/>
+          <w:numId w:val="3"/>
+        </w:numPr>
+        <w:spacing w:after="40" w:line="264" w:lineRule="auto"/>
+        <w:jc w:val="both"/>
+      </w:pPr>
+      <w:r>
+        <w:t>El sistema institucional envía una solicitud HTTP a la API institucional incluyendo su API Key.</w:t>
+      </w:r>
+    </w:p>
+    <w:p>
+      <w:pPr>
+        <w:pStyle w:val="Prrafodelista"/>
+        <w:numPr>
+          <w:ilvl w:val="0"/>
+          <w:numId w:val="3"/>
+        </w:numPr>
+        <w:spacing w:after="40" w:line="264" w:lineRule="auto"/>
+        <w:jc w:val="both"/>
+      </w:pPr>
+      <w:r>
+        <w:t>El sistema valida la API Key y verifica que el alcance solicitado esté autorizado.</w:t>
+      </w:r>
+    </w:p>
+    <w:p>
+      <w:pPr>
+        <w:pStyle w:val="Prrafodelista"/>
+        <w:numPr>
+          <w:ilvl w:val="0"/>
+          <w:numId w:val="3"/>
+        </w:numPr>
+        <w:spacing w:after="40" w:line="264" w:lineRule="auto"/>
+        <w:jc w:val="both"/>
+      </w:pPr>
+      <w:r>
+        <w:t>El sistema verifica que la solicitud no exceda el límite de solicitudes (rate limiting) configurado.</w:t>
+      </w:r>
+    </w:p>
+    <w:p>
+      <w:pPr>
+        <w:pStyle w:val="Prrafodelista"/>
+        <w:numPr>
+          <w:ilvl w:val="0"/>
+          <w:numId w:val="3"/>
+        </w:numPr>
+        <w:spacing w:after="40" w:line="264" w:lineRule="auto"/>
+        <w:jc w:val="both"/>
+      </w:pPr>
+      <w:r>
+        <w:t>El sistema registra la solicitud en la bitácora de auditoría.</w:t>
+      </w:r>
+    </w:p>
+    <w:p>
+      <w:pPr>
+        <w:pStyle w:val="Prrafodelista"/>
+        <w:numPr>
+          <w:ilvl w:val="0"/>
+          <w:numId w:val="3"/>
+        </w:numPr>
+        <w:spacing w:after="40" w:line="264" w:lineRule="auto"/>
+        <w:jc w:val="both"/>
+      </w:pPr>
+      <w:r>
+        <w:t>El sistema devuelve los datos epidemiológicos o de mortalidad respiratoria solicitados.</w:t>
+      </w:r>
+    </w:p>
+    <w:p>
+      <w:pPr/>
+      <w:r>
+        <w:rPr>
+          <w:b/>
+        </w:rPr>
+        <w:t xml:space="preserve">Postcondiciones: </w:t>
+      </w:r>
+      <w:r>
+        <w:t>Datos epidemiológicos entregados a la institución y solicitud registrada en auditoría.</w:t>
+      </w:r>
+    </w:p>
+    <w:p>
+      <w:pPr/>
+      <w:r>
+        <w:rPr>
+          <w:b/>
+        </w:rPr>
+        <w:t>Flujos alternativos:</w:t>
+      </w:r>
+    </w:p>
+    <w:p>
+      <w:pPr>
+        <w:pStyle w:val="Prrafodelista"/>
+        <w:numPr>
+          <w:ilvl w:val="0"/>
+          <w:numId w:val="2"/>
+        </w:numPr>
+        <w:spacing w:after="60" w:line="264" w:lineRule="auto"/>
+        <w:jc w:val="both"/>
+      </w:pPr>
+      <w:r>
+        <w:t>1a. API Key inválida o expirada: el sistema rechaza la solicitud con un error de autenticación.</w:t>
+      </w:r>
+    </w:p>
+    <w:p>
+      <w:pPr>
+        <w:pStyle w:val="Prrafodelista"/>
+        <w:numPr>
+          <w:ilvl w:val="0"/>
+          <w:numId w:val="2"/>
+        </w:numPr>
+        <w:spacing w:after="60" w:line="264" w:lineRule="auto"/>
+        <w:jc w:val="both"/>
+      </w:pPr>
+      <w:r>
+        <w:t>2a. Alcance no autorizado: el sistema rechaza la solicitud con un error de autorización.</w:t>
+      </w:r>
+    </w:p>
+    <w:p>
+      <w:pPr>
+        <w:pStyle w:val="Prrafodelista"/>
+        <w:numPr>
+          <w:ilvl w:val="0"/>
+          <w:numId w:val="2"/>
+        </w:numPr>
+        <w:spacing w:after="60" w:line="264" w:lineRule="auto"/>
+        <w:jc w:val="both"/>
+      </w:pPr>
+      <w:r>
+        <w:t>3a. Límite de solicitudes excedido: el sistema rechaza la solicitud indicando el tiempo de espera permitido.</w:t>
+      </w:r>
+    </w:p>
+    <w:p>
+      <w:pPr>
+        <w:pStyle w:val="Ttulo3"/>
+      </w:pPr>
+      <w:r>
+        <w:t>CU-016: Validar predicción de IA con signos vitales del wearable</w:t>
+      </w:r>
+    </w:p>
+    <w:p>
+      <w:pPr/>
+      <w:r>
+        <w:rPr>
+          <w:b/>
+        </w:rPr>
+        <w:t xml:space="preserve">Actores: </w:t>
+      </w:r>
+      <w:r>
+        <w:t>Paciente, Sistema de IA</w:t>
+      </w:r>
+    </w:p>
+    <w:p>
+      <w:pPr/>
+      <w:r>
+        <w:rPr>
+          <w:b/>
+        </w:rPr>
+        <w:t xml:space="preserve">Precondiciones: </w:t>
+      </w:r>
+      <w:r>
+        <w:t>El paciente ha vinculado un dispositivo wearable y el sistema ha generado una predicción de riesgo respiratorio.</w:t>
+      </w:r>
+    </w:p>
+    <w:p>
+      <w:pPr/>
+      <w:r>
+        <w:rPr>
+          <w:b/>
+        </w:rPr>
+        <w:t>Flujo principal:</w:t>
+      </w:r>
+    </w:p>
+    <w:p>
+      <w:pPr>
+        <w:pStyle w:val="Prrafodelista"/>
+        <w:numPr>
+          <w:ilvl w:val="0"/>
+          <w:numId w:val="3"/>
+        </w:numPr>
+        <w:spacing w:after="40" w:line="264" w:lineRule="auto"/>
+        <w:jc w:val="both"/>
+      </w:pPr>
+      <w:r>
+        <w:t>El sistema obtiene los signos vitales recientes del wearable del paciente (frecuencia cardíaca, SpO2).</w:t>
+      </w:r>
+    </w:p>
+    <w:p>
+      <w:pPr>
+        <w:pStyle w:val="Prrafodelista"/>
+        <w:numPr>
+          <w:ilvl w:val="0"/>
+          <w:numId w:val="3"/>
+        </w:numPr>
+        <w:spacing w:after="40" w:line="264" w:lineRule="auto"/>
+        <w:jc w:val="both"/>
+      </w:pPr>
+      <w:r>
+        <w:t>El sistema aplica las reglas clínicas de validación sobre la predicción generada por la IA.</w:t>
+      </w:r>
+    </w:p>
+    <w:p>
+      <w:pPr>
+        <w:pStyle w:val="Prrafodelista"/>
+        <w:numPr>
+          <w:ilvl w:val="0"/>
+          <w:numId w:val="3"/>
+        </w:numPr>
+        <w:spacing w:after="40" w:line="264" w:lineRule="auto"/>
+        <w:jc w:val="both"/>
+      </w:pPr>
+      <w:r>
+        <w:t>El sistema ajusta el nivel de riesgo si los signos vitales indican una inconsistencia clínicamente relevante.</w:t>
+      </w:r>
+    </w:p>
+    <w:p>
+      <w:pPr>
+        <w:pStyle w:val="Prrafodelista"/>
+        <w:numPr>
+          <w:ilvl w:val="0"/>
+          <w:numId w:val="3"/>
+        </w:numPr>
+        <w:spacing w:after="40" w:line="264" w:lineRule="auto"/>
+        <w:jc w:val="both"/>
+      </w:pPr>
+      <w:r>
+        <w:t>El sistema muestra al usuario la predicción validada, indicando si fue ajustada por datos del wearable.</w:t>
+      </w:r>
+    </w:p>
+    <w:p>
+      <w:pPr/>
+      <w:r>
+        <w:rPr>
+          <w:b/>
+        </w:rPr>
+        <w:t xml:space="preserve">Postcondiciones: </w:t>
+      </w:r>
+      <w:r>
+        <w:t>Predicción de riesgo validada (y ajustada de ser necesario) mostrada al paciente y/o médico.</w:t>
+      </w:r>
+    </w:p>
+    <w:p>
+      <w:pPr/>
+      <w:r>
+        <w:rPr>
+          <w:b/>
+        </w:rPr>
+        <w:t>Flujos alternativos:</w:t>
+      </w:r>
+    </w:p>
+    <w:p>
+      <w:pPr>
+        <w:pStyle w:val="Prrafodelista"/>
+        <w:numPr>
+          <w:ilvl w:val="0"/>
+          <w:numId w:val="2"/>
+        </w:numPr>
+        <w:spacing w:after="60" w:line="264" w:lineRule="auto"/>
+        <w:jc w:val="both"/>
+      </w:pPr>
+      <w:r>
+        <w:t>1a. Signo vital no confiable o fuera de rango fisiológico: el sistema descarta el dato y revierte automáticamente al resultado original de la IA sin el signo vital.</w:t>
+      </w:r>
+    </w:p>
+    <w:p>
+      <w:pPr>
+        <w:pStyle w:val="Prrafodelista"/>
+        <w:numPr>
+          <w:ilvl w:val="0"/>
+          <w:numId w:val="2"/>
+        </w:numPr>
+        <w:spacing w:after="60" w:line="264" w:lineRule="auto"/>
+        <w:jc w:val="both"/>
+      </w:pPr>
+      <w:r>
+        <w:t>2a. Wearable no vinculado o sin datos recientes: el sistema omite la capa de validación y muestra la predicción original de la IA.</w:t>
       </w:r>
     </w:p>
     <w:p>

</xml_diff>